<commit_message>
docs(ape-4): list the prompts used in the AI declaration
</commit_message>
<xml_diff>
--- a/unidad-1/ape-4-sir-herramientas/documento/APE4.docx
+++ b/unidad-1/ape-4-sir-herramientas/documento/APE4.docx
@@ -4717,6 +4717,521 @@
     </w:p>
     <w:p>
       <w:pPr>
+        <w:keepNext w:val="0"/>
+        <w:jc w:val="both"/>
+      </w:pPr>
+      <w:r>
+        <w:rPr>
+          <w:b w:val="0"/>
+        </w:rPr>
+        <w:t>La Tabla 7 recoge, en orden y de forma textual, los prompts que escribí al agente desde el análisis inicial de la guía; solo reemplacé las rutas de archivos por una descripción entre corchetes.</w:t>
+      </w:r>
+    </w:p>
+    <w:p>
+      <w:pPr>
+        <w:keepNext/>
+        <w:jc w:val="center"/>
+      </w:pPr>
+      <w:r>
+        <w:rPr>
+          <w:b w:val="0"/>
+          <w:sz w:val="18"/>
+        </w:rPr>
+        <w:t>Tabla 7. Prompts utilizados con el agente de IA, en orden cronológico</w:t>
+      </w:r>
+    </w:p>
+    <w:tbl>
+      <w:tblPr>
+        <w:tblW w:type="auto" w:w="0"/>
+        <w:jc w:val="center"/>
+        <w:tblBorders>
+          <w:top w:val="single" w:sz="6" w:color="000000"/>
+          <w:left w:val="single" w:sz="6" w:color="000000"/>
+          <w:bottom w:val="single" w:sz="6" w:color="000000"/>
+          <w:right w:val="single" w:sz="6" w:color="000000"/>
+          <w:insideH w:val="single" w:sz="6" w:color="000000"/>
+          <w:insideV w:val="single" w:sz="6" w:color="000000"/>
+        </w:tblBorders>
+        <w:tblLayout w:type="fixed"/>
+        <w:tblLook w:firstColumn="1" w:firstRow="1" w:lastColumn="0" w:lastRow="0" w:noHBand="0" w:noVBand="1" w:val="04A0"/>
+      </w:tblPr>
+      <w:tblGrid>
+        <w:gridCol w:w="737"/>
+        <w:gridCol w:w="8334"/>
+      </w:tblGrid>
+      <w:tr>
+        <w:trPr>
+          <w:cantSplit/>
+          <w:tblHeader w:val="true"/>
+        </w:trPr>
+        <w:tc>
+          <w:tcPr>
+            <w:tcW w:type="dxa" w:w="737"/>
+          </w:tcPr>
+          <w:p>
+            <w:pPr>
+              <w:keepNext/>
+              <w:spacing w:before="40" w:after="40" w:line="240" w:lineRule="auto"/>
+              <w:jc w:val="center"/>
+            </w:pPr>
+            <w:r>
+              <w:rPr>
+                <w:b/>
+                <w:sz w:val="19"/>
+              </w:rPr>
+              <w:t>N.º</w:t>
+            </w:r>
+          </w:p>
+        </w:tc>
+        <w:tc>
+          <w:tcPr>
+            <w:tcW w:type="dxa" w:w="8334"/>
+          </w:tcPr>
+          <w:p>
+            <w:pPr>
+              <w:keepNext/>
+              <w:spacing w:before="40" w:after="40" w:line="240" w:lineRule="auto"/>
+              <w:jc w:val="center"/>
+            </w:pPr>
+            <w:r>
+              <w:rPr>
+                <w:b/>
+                <w:sz w:val="19"/>
+              </w:rPr>
+              <w:t>Prompt utilizado</w:t>
+            </w:r>
+          </w:p>
+        </w:tc>
+      </w:tr>
+      <w:tr>
+        <w:trPr>
+          <w:cantSplit/>
+        </w:trPr>
+        <w:tc>
+          <w:tcPr>
+            <w:tcW w:type="dxa" w:w="737"/>
+          </w:tcPr>
+          <w:p>
+            <w:pPr>
+              <w:keepNext w:val="0"/>
+              <w:spacing w:before="40" w:after="40" w:line="240" w:lineRule="auto"/>
+              <w:jc w:val="center"/>
+            </w:pPr>
+            <w:r>
+              <w:rPr>
+                <w:b/>
+                <w:sz w:val="19"/>
+              </w:rPr>
+              <w:t>1</w:t>
+            </w:r>
+          </w:p>
+        </w:tc>
+        <w:tc>
+          <w:tcPr>
+            <w:tcW w:type="dxa" w:w="8334"/>
+          </w:tcPr>
+          <w:p>
+            <w:pPr>
+              <w:keepNext w:val="0"/>
+              <w:spacing w:before="40" w:after="40" w:line="240" w:lineRule="auto"/>
+            </w:pPr>
+            <w:r>
+              <w:rPr>
+                <w:b w:val="0"/>
+                <w:sz w:val="19"/>
+              </w:rPr>
+              <w:t>[guía de la práctica, PDF] tengo que hacer la practica 4, ya lanza subagentes en paralelo fast que comiencen a ahacerlo rapido, la idea del docente era la data en phython y todo el proceso pero la simulacion en netlogo</w:t>
+            </w:r>
+          </w:p>
+        </w:tc>
+      </w:tr>
+      <w:tr>
+        <w:trPr>
+          <w:cantSplit/>
+        </w:trPr>
+        <w:tc>
+          <w:tcPr>
+            <w:tcW w:type="dxa" w:w="737"/>
+          </w:tcPr>
+          <w:p>
+            <w:pPr>
+              <w:keepNext w:val="0"/>
+              <w:spacing w:before="40" w:after="40" w:line="240" w:lineRule="auto"/>
+              <w:jc w:val="center"/>
+            </w:pPr>
+            <w:r>
+              <w:rPr>
+                <w:b/>
+                <w:sz w:val="19"/>
+              </w:rPr>
+              <w:t>2</w:t>
+            </w:r>
+          </w:p>
+        </w:tc>
+        <w:tc>
+          <w:tcPr>
+            <w:tcW w:type="dxa" w:w="8334"/>
+          </w:tcPr>
+          <w:p>
+            <w:pPr>
+              <w:keepNext w:val="0"/>
+              <w:spacing w:before="40" w:after="40" w:line="240" w:lineRule="auto"/>
+            </w:pPr>
+            <w:r>
+              <w:rPr>
+                <w:b w:val="0"/>
+                <w:sz w:val="19"/>
+              </w:rPr>
+              <w:t>crea el repo del ape 4 grupal como se hizo en el ape 3 y ahi explicas como mis compañeros levantan el codigo, readme e indicaciones todo en español y sencillo</w:t>
+            </w:r>
+          </w:p>
+        </w:tc>
+      </w:tr>
+      <w:tr>
+        <w:trPr>
+          <w:cantSplit/>
+        </w:trPr>
+        <w:tc>
+          <w:tcPr>
+            <w:tcW w:type="dxa" w:w="737"/>
+          </w:tcPr>
+          <w:p>
+            <w:pPr>
+              <w:keepNext w:val="0"/>
+              <w:spacing w:before="40" w:after="40" w:line="240" w:lineRule="auto"/>
+              <w:jc w:val="center"/>
+            </w:pPr>
+            <w:r>
+              <w:rPr>
+                <w:b/>
+                <w:sz w:val="19"/>
+              </w:rPr>
+              <w:t>3</w:t>
+            </w:r>
+          </w:p>
+        </w:tc>
+        <w:tc>
+          <w:tcPr>
+            <w:tcW w:type="dxa" w:w="8334"/>
+          </w:tcPr>
+          <w:p>
+            <w:pPr>
+              <w:keepNext w:val="0"/>
+              <w:spacing w:before="40" w:after="40" w:line="240" w:lineRule="auto"/>
+            </w:pPr>
+            <w:r>
+              <w:rPr>
+                <w:b w:val="0"/>
+                <w:sz w:val="19"/>
+              </w:rPr>
+              <w:t>en java no hay que hacer</w:t>
+            </w:r>
+          </w:p>
+        </w:tc>
+      </w:tr>
+      <w:tr>
+        <w:trPr>
+          <w:cantSplit/>
+        </w:trPr>
+        <w:tc>
+          <w:tcPr>
+            <w:tcW w:type="dxa" w:w="737"/>
+          </w:tcPr>
+          <w:p>
+            <w:pPr>
+              <w:keepNext w:val="0"/>
+              <w:spacing w:before="40" w:after="40" w:line="240" w:lineRule="auto"/>
+              <w:jc w:val="center"/>
+            </w:pPr>
+            <w:r>
+              <w:rPr>
+                <w:b/>
+                <w:sz w:val="19"/>
+              </w:rPr>
+              <w:t>4</w:t>
+            </w:r>
+          </w:p>
+        </w:tc>
+        <w:tc>
+          <w:tcPr>
+            <w:tcW w:type="dxa" w:w="8334"/>
+          </w:tcPr>
+          <w:p>
+            <w:pPr>
+              <w:keepNext w:val="0"/>
+              <w:spacing w:before="40" w:after="40" w:line="240" w:lineRule="auto"/>
+            </w:pPr>
+            <w:r>
+              <w:rPr>
+                <w:b w:val="0"/>
+                <w:sz w:val="19"/>
+              </w:rPr>
+              <w:t>solo en phython si hicimos en pyhton</w:t>
+            </w:r>
+          </w:p>
+        </w:tc>
+      </w:tr>
+      <w:tr>
+        <w:trPr>
+          <w:cantSplit/>
+        </w:trPr>
+        <w:tc>
+          <w:tcPr>
+            <w:tcW w:type="dxa" w:w="737"/>
+          </w:tcPr>
+          <w:p>
+            <w:pPr>
+              <w:keepNext w:val="0"/>
+              <w:spacing w:before="40" w:after="40" w:line="240" w:lineRule="auto"/>
+              <w:jc w:val="center"/>
+            </w:pPr>
+            <w:r>
+              <w:rPr>
+                <w:b/>
+                <w:sz w:val="19"/>
+              </w:rPr>
+              <w:t>5</w:t>
+            </w:r>
+          </w:p>
+        </w:tc>
+        <w:tc>
+          <w:tcPr>
+            <w:tcW w:type="dxa" w:w="8334"/>
+          </w:tcPr>
+          <w:p>
+            <w:pPr>
+              <w:keepNext w:val="0"/>
+              <w:spacing w:before="40" w:after="40" w:line="240" w:lineRule="auto"/>
+            </w:pPr>
+            <w:r>
+              <w:rPr>
+                <w:b w:val="0"/>
+                <w:sz w:val="19"/>
+              </w:rPr>
+              <w:t>el informe aun no, tenemos que pulir tema codigo. mergealo y pushea, luego indicame como funciona y como analizarlos desde vscode</w:t>
+            </w:r>
+          </w:p>
+        </w:tc>
+      </w:tr>
+      <w:tr>
+        <w:trPr>
+          <w:cantSplit/>
+        </w:trPr>
+        <w:tc>
+          <w:tcPr>
+            <w:tcW w:type="dxa" w:w="737"/>
+          </w:tcPr>
+          <w:p>
+            <w:pPr>
+              <w:keepNext w:val="0"/>
+              <w:spacing w:before="40" w:after="40" w:line="240" w:lineRule="auto"/>
+              <w:jc w:val="center"/>
+            </w:pPr>
+            <w:r>
+              <w:rPr>
+                <w:b/>
+                <w:sz w:val="19"/>
+              </w:rPr>
+              <w:t>6</w:t>
+            </w:r>
+          </w:p>
+        </w:tc>
+        <w:tc>
+          <w:tcPr>
+            <w:tcW w:type="dxa" w:w="8334"/>
+          </w:tcPr>
+          <w:p>
+            <w:pPr>
+              <w:keepNext w:val="0"/>
+              <w:spacing w:before="40" w:after="40" w:line="240" w:lineRule="auto"/>
+            </w:pPr>
+            <w:r>
+              <w:rPr>
+                <w:b w:val="0"/>
+                <w:sz w:val="19"/>
+              </w:rPr>
+              <w:t>[captura de pantalla] no sale para correr desde main</w:t>
+            </w:r>
+          </w:p>
+        </w:tc>
+      </w:tr>
+      <w:tr>
+        <w:trPr>
+          <w:cantSplit/>
+        </w:trPr>
+        <w:tc>
+          <w:tcPr>
+            <w:tcW w:type="dxa" w:w="737"/>
+          </w:tcPr>
+          <w:p>
+            <w:pPr>
+              <w:keepNext w:val="0"/>
+              <w:spacing w:before="40" w:after="40" w:line="240" w:lineRule="auto"/>
+              <w:jc w:val="center"/>
+            </w:pPr>
+            <w:r>
+              <w:rPr>
+                <w:b/>
+                <w:sz w:val="19"/>
+              </w:rPr>
+              <w:t>7</w:t>
+            </w:r>
+          </w:p>
+        </w:tc>
+        <w:tc>
+          <w:tcPr>
+            <w:tcW w:type="dxa" w:w="8334"/>
+          </w:tcPr>
+          <w:p>
+            <w:pPr>
+              <w:keepNext w:val="0"/>
+              <w:spacing w:before="40" w:after="40" w:line="240" w:lineRule="auto"/>
+            </w:pPr>
+            <w:r>
+              <w:rPr>
+                <w:b w:val="0"/>
+                <w:sz w:val="19"/>
+              </w:rPr>
+              <w:t>[captura de pantalla] mira como se abre netlogo</w:t>
+            </w:r>
+          </w:p>
+        </w:tc>
+      </w:tr>
+      <w:tr>
+        <w:trPr>
+          <w:cantSplit/>
+        </w:trPr>
+        <w:tc>
+          <w:tcPr>
+            <w:tcW w:type="dxa" w:w="737"/>
+          </w:tcPr>
+          <w:p>
+            <w:pPr>
+              <w:keepNext w:val="0"/>
+              <w:spacing w:before="40" w:after="40" w:line="240" w:lineRule="auto"/>
+              <w:jc w:val="center"/>
+            </w:pPr>
+            <w:r>
+              <w:rPr>
+                <w:b/>
+                <w:sz w:val="19"/>
+              </w:rPr>
+              <w:t>8</w:t>
+            </w:r>
+          </w:p>
+        </w:tc>
+        <w:tc>
+          <w:tcPr>
+            <w:tcW w:type="dxa" w:w="8334"/>
+          </w:tcPr>
+          <w:p>
+            <w:pPr>
+              <w:keepNext w:val="0"/>
+              <w:spacing w:before="40" w:after="40" w:line="240" w:lineRule="auto"/>
+            </w:pPr>
+            <w:r>
+              <w:rPr>
+                <w:b w:val="0"/>
+                <w:sz w:val="19"/>
+              </w:rPr>
+              <w:t>ya lo abri, ya anda, ahora podriamos avanazar con el documento personal, ya no es grupal</w:t>
+            </w:r>
+          </w:p>
+        </w:tc>
+      </w:tr>
+      <w:tr>
+        <w:trPr>
+          <w:cantSplit/>
+        </w:trPr>
+        <w:tc>
+          <w:tcPr>
+            <w:tcW w:type="dxa" w:w="737"/>
+          </w:tcPr>
+          <w:p>
+            <w:pPr>
+              <w:keepNext w:val="0"/>
+              <w:spacing w:before="40" w:after="40" w:line="240" w:lineRule="auto"/>
+              <w:jc w:val="center"/>
+            </w:pPr>
+            <w:r>
+              <w:rPr>
+                <w:b/>
+                <w:sz w:val="19"/>
+              </w:rPr>
+              <w:t>9</w:t>
+            </w:r>
+          </w:p>
+        </w:tc>
+        <w:tc>
+          <w:tcPr>
+            <w:tcW w:type="dxa" w:w="8334"/>
+          </w:tcPr>
+          <w:p>
+            <w:pPr>
+              <w:keepNext w:val="0"/>
+              <w:spacing w:before="40" w:after="40" w:line="240" w:lineRule="auto"/>
+            </w:pPr>
+            <w:r>
+              <w:rPr>
+                <w:b w:val="0"/>
+                <w:sz w:val="19"/>
+              </w:rPr>
+              <w:t>no se sube el vidoe de demostracion, ademas por otro lado quiero que mejores la simulacion en netlogo en cuanto a lo visual uses personas y animaciones mas reales</w:t>
+            </w:r>
+          </w:p>
+        </w:tc>
+      </w:tr>
+      <w:tr>
+        <w:trPr>
+          <w:cantSplit/>
+        </w:trPr>
+        <w:tc>
+          <w:tcPr>
+            <w:tcW w:type="dxa" w:w="737"/>
+          </w:tcPr>
+          <w:p>
+            <w:pPr>
+              <w:keepNext w:val="0"/>
+              <w:spacing w:before="40" w:after="40" w:line="240" w:lineRule="auto"/>
+              <w:jc w:val="center"/>
+            </w:pPr>
+            <w:r>
+              <w:rPr>
+                <w:b/>
+                <w:sz w:val="19"/>
+              </w:rPr>
+              <w:t>10</w:t>
+            </w:r>
+          </w:p>
+        </w:tc>
+        <w:tc>
+          <w:tcPr>
+            <w:tcW w:type="dxa" w:w="8334"/>
+          </w:tcPr>
+          <w:p>
+            <w:pPr>
+              <w:keepNext w:val="0"/>
+              <w:spacing w:before="40" w:after="40" w:line="240" w:lineRule="auto"/>
+            </w:pPr>
+            <w:r>
+              <w:rPr>
+                <w:b w:val="0"/>
+                <w:sz w:val="19"/>
+              </w:rPr>
+              <w:t>lo de netlogo lo ponemos en el repo personal no en el grupal no mergees ahi en el grupal, mientras en paralelo explicame el codigo</w:t>
+            </w:r>
+          </w:p>
+        </w:tc>
+      </w:tr>
+    </w:tbl>
+    <w:p>
+      <w:pPr>
+        <w:spacing w:after="0"/>
+        <w:ind w:left="0"/>
+      </w:pPr>
+    </w:p>
+    <w:p>
+      <w:pPr>
         <w:keepNext/>
         <w:spacing w:before="240"/>
       </w:pPr>

</xml_diff>

<commit_message>
docs(ape-4): keep only the main prompts in the AI declaration
</commit_message>
<xml_diff>
--- a/unidad-1/ape-4-sir-herramientas/documento/APE4.docx
+++ b/unidad-1/ape-4-sir-herramientas/documento/APE4.docx
@@ -4724,7 +4724,7 @@
         <w:rPr>
           <w:b w:val="0"/>
         </w:rPr>
-        <w:t>La Tabla 7 recoge, en orden y de forma textual, los prompts que escribí al agente desde el análisis inicial de la guía; solo reemplacé las rutas de archivos por una descripción entre corchetes.</w:t>
+        <w:t>La Tabla 7 recoge, en orden y de forma textual, los principales prompts que escribí al agente.</w:t>
       </w:r>
     </w:p>
     <w:p>
@@ -4840,7 +4840,7 @@
                 <w:b w:val="0"/>
                 <w:sz w:val="19"/>
               </w:rPr>
-              <w:t>[guía de la práctica, PDF] tengo que hacer la practica 4, ya lanza subagentes en paralelo fast que comiencen a ahacerlo rapido, la idea del docente era la data en phython y todo el proceso pero la simulacion en netlogo</w:t>
+              <w:t>crea el repo del ape 4 grupal como se hizo en el ape 3 y ahi explicas como mis compañeros levantan el codigo, readme e indicaciones todo en español y sencillo</w:t>
             </w:r>
           </w:p>
         </w:tc>
@@ -4882,7 +4882,7 @@
                 <w:b w:val="0"/>
                 <w:sz w:val="19"/>
               </w:rPr>
-              <w:t>crea el repo del ape 4 grupal como se hizo en el ape 3 y ahi explicas como mis compañeros levantan el codigo, readme e indicaciones todo en español y sencillo</w:t>
+              <w:t>en java no hay que hacer</w:t>
             </w:r>
           </w:p>
         </w:tc>
@@ -4924,7 +4924,7 @@
                 <w:b w:val="0"/>
                 <w:sz w:val="19"/>
               </w:rPr>
-              <w:t>en java no hay que hacer</w:t>
+              <w:t>solo en phython si hicimos en pyhton</w:t>
             </w:r>
           </w:p>
         </w:tc>
@@ -4966,7 +4966,7 @@
                 <w:b w:val="0"/>
                 <w:sz w:val="19"/>
               </w:rPr>
-              <w:t>solo en phython si hicimos en pyhton</w:t>
+              <w:t>el informe aun no, tenemos que pulir tema codigo. mergealo y pushea, luego indicame como funciona y como analizarlos desde vscode</w:t>
             </w:r>
           </w:p>
         </w:tc>
@@ -4991,216 +4991,6 @@
                 <w:sz w:val="19"/>
               </w:rPr>
               <w:t>5</w:t>
-            </w:r>
-          </w:p>
-        </w:tc>
-        <w:tc>
-          <w:tcPr>
-            <w:tcW w:type="dxa" w:w="8334"/>
-          </w:tcPr>
-          <w:p>
-            <w:pPr>
-              <w:keepNext w:val="0"/>
-              <w:spacing w:before="40" w:after="40" w:line="240" w:lineRule="auto"/>
-            </w:pPr>
-            <w:r>
-              <w:rPr>
-                <w:b w:val="0"/>
-                <w:sz w:val="19"/>
-              </w:rPr>
-              <w:t>el informe aun no, tenemos que pulir tema codigo. mergealo y pushea, luego indicame como funciona y como analizarlos desde vscode</w:t>
-            </w:r>
-          </w:p>
-        </w:tc>
-      </w:tr>
-      <w:tr>
-        <w:trPr>
-          <w:cantSplit/>
-        </w:trPr>
-        <w:tc>
-          <w:tcPr>
-            <w:tcW w:type="dxa" w:w="737"/>
-          </w:tcPr>
-          <w:p>
-            <w:pPr>
-              <w:keepNext w:val="0"/>
-              <w:spacing w:before="40" w:after="40" w:line="240" w:lineRule="auto"/>
-              <w:jc w:val="center"/>
-            </w:pPr>
-            <w:r>
-              <w:rPr>
-                <w:b/>
-                <w:sz w:val="19"/>
-              </w:rPr>
-              <w:t>6</w:t>
-            </w:r>
-          </w:p>
-        </w:tc>
-        <w:tc>
-          <w:tcPr>
-            <w:tcW w:type="dxa" w:w="8334"/>
-          </w:tcPr>
-          <w:p>
-            <w:pPr>
-              <w:keepNext w:val="0"/>
-              <w:spacing w:before="40" w:after="40" w:line="240" w:lineRule="auto"/>
-            </w:pPr>
-            <w:r>
-              <w:rPr>
-                <w:b w:val="0"/>
-                <w:sz w:val="19"/>
-              </w:rPr>
-              <w:t>[captura de pantalla] no sale para correr desde main</w:t>
-            </w:r>
-          </w:p>
-        </w:tc>
-      </w:tr>
-      <w:tr>
-        <w:trPr>
-          <w:cantSplit/>
-        </w:trPr>
-        <w:tc>
-          <w:tcPr>
-            <w:tcW w:type="dxa" w:w="737"/>
-          </w:tcPr>
-          <w:p>
-            <w:pPr>
-              <w:keepNext w:val="0"/>
-              <w:spacing w:before="40" w:after="40" w:line="240" w:lineRule="auto"/>
-              <w:jc w:val="center"/>
-            </w:pPr>
-            <w:r>
-              <w:rPr>
-                <w:b/>
-                <w:sz w:val="19"/>
-              </w:rPr>
-              <w:t>7</w:t>
-            </w:r>
-          </w:p>
-        </w:tc>
-        <w:tc>
-          <w:tcPr>
-            <w:tcW w:type="dxa" w:w="8334"/>
-          </w:tcPr>
-          <w:p>
-            <w:pPr>
-              <w:keepNext w:val="0"/>
-              <w:spacing w:before="40" w:after="40" w:line="240" w:lineRule="auto"/>
-            </w:pPr>
-            <w:r>
-              <w:rPr>
-                <w:b w:val="0"/>
-                <w:sz w:val="19"/>
-              </w:rPr>
-              <w:t>[captura de pantalla] mira como se abre netlogo</w:t>
-            </w:r>
-          </w:p>
-        </w:tc>
-      </w:tr>
-      <w:tr>
-        <w:trPr>
-          <w:cantSplit/>
-        </w:trPr>
-        <w:tc>
-          <w:tcPr>
-            <w:tcW w:type="dxa" w:w="737"/>
-          </w:tcPr>
-          <w:p>
-            <w:pPr>
-              <w:keepNext w:val="0"/>
-              <w:spacing w:before="40" w:after="40" w:line="240" w:lineRule="auto"/>
-              <w:jc w:val="center"/>
-            </w:pPr>
-            <w:r>
-              <w:rPr>
-                <w:b/>
-                <w:sz w:val="19"/>
-              </w:rPr>
-              <w:t>8</w:t>
-            </w:r>
-          </w:p>
-        </w:tc>
-        <w:tc>
-          <w:tcPr>
-            <w:tcW w:type="dxa" w:w="8334"/>
-          </w:tcPr>
-          <w:p>
-            <w:pPr>
-              <w:keepNext w:val="0"/>
-              <w:spacing w:before="40" w:after="40" w:line="240" w:lineRule="auto"/>
-            </w:pPr>
-            <w:r>
-              <w:rPr>
-                <w:b w:val="0"/>
-                <w:sz w:val="19"/>
-              </w:rPr>
-              <w:t>ya lo abri, ya anda, ahora podriamos avanazar con el documento personal, ya no es grupal</w:t>
-            </w:r>
-          </w:p>
-        </w:tc>
-      </w:tr>
-      <w:tr>
-        <w:trPr>
-          <w:cantSplit/>
-        </w:trPr>
-        <w:tc>
-          <w:tcPr>
-            <w:tcW w:type="dxa" w:w="737"/>
-          </w:tcPr>
-          <w:p>
-            <w:pPr>
-              <w:keepNext w:val="0"/>
-              <w:spacing w:before="40" w:after="40" w:line="240" w:lineRule="auto"/>
-              <w:jc w:val="center"/>
-            </w:pPr>
-            <w:r>
-              <w:rPr>
-                <w:b/>
-                <w:sz w:val="19"/>
-              </w:rPr>
-              <w:t>9</w:t>
-            </w:r>
-          </w:p>
-        </w:tc>
-        <w:tc>
-          <w:tcPr>
-            <w:tcW w:type="dxa" w:w="8334"/>
-          </w:tcPr>
-          <w:p>
-            <w:pPr>
-              <w:keepNext w:val="0"/>
-              <w:spacing w:before="40" w:after="40" w:line="240" w:lineRule="auto"/>
-            </w:pPr>
-            <w:r>
-              <w:rPr>
-                <w:b w:val="0"/>
-                <w:sz w:val="19"/>
-              </w:rPr>
-              <w:t>no se sube el vidoe de demostracion, ademas por otro lado quiero que mejores la simulacion en netlogo en cuanto a lo visual uses personas y animaciones mas reales</w:t>
-            </w:r>
-          </w:p>
-        </w:tc>
-      </w:tr>
-      <w:tr>
-        <w:trPr>
-          <w:cantSplit/>
-        </w:trPr>
-        <w:tc>
-          <w:tcPr>
-            <w:tcW w:type="dxa" w:w="737"/>
-          </w:tcPr>
-          <w:p>
-            <w:pPr>
-              <w:keepNext w:val="0"/>
-              <w:spacing w:before="40" w:after="40" w:line="240" w:lineRule="auto"/>
-              <w:jc w:val="center"/>
-            </w:pPr>
-            <w:r>
-              <w:rPr>
-                <w:b/>
-                <w:sz w:val="19"/>
-              </w:rPr>
-              <w:t>10</w:t>
             </w:r>
           </w:p>
         </w:tc>

</xml_diff>

<commit_message>
docs(ape-4): split the AI declaration into use, review and prompts
</commit_message>
<xml_diff>
--- a/unidad-1/ape-4-sir-herramientas/documento/APE4.docx
+++ b/unidad-1/ape-4-sir-herramientas/documento/APE4.docx
@@ -4705,6 +4705,18 @@
     </w:p>
     <w:p>
       <w:pPr>
+        <w:keepNext/>
+        <w:spacing w:before="160"/>
+      </w:pPr>
+      <w:r>
+        <w:rPr>
+          <w:b/>
+        </w:rPr>
+        <w:t>Uso de la IA</w:t>
+      </w:r>
+    </w:p>
+    <w:p>
+      <w:pPr>
         <w:keepNext w:val="0"/>
         <w:jc w:val="both"/>
       </w:pPr>
@@ -4712,7 +4724,94 @@
         <w:rPr>
           <w:b w:val="0"/>
         </w:rPr>
-        <w:t>En esta práctica utilicé un agente de programación (el Gentleman, Pi) basado en el modelo Claude de Anthropic como herramienta de apoyo para leer la guía y proponer la regla de contacto común, escribir el modelo en SimPy con arquitectura MVC y sus 9 pruebas, construir el modelo de NetLogo (botones, gráficos e importación del CSV, personas animadas), generar las figuras, medir las réplicas y los tiempos, y redactar borradores de este informe. Las decisiones de alcance (sin Java), de la regla de contacto, de la semilla 42 y del contenido las tomé yo. Corregí tres errores de la IA: la semilla de NetLogo estaba en 12345 y la pasé a 42 para igualar a Python; el modelo de NetLogo se abrió como modelo vacío en la interfaz, se corrigió y lo comprobé abriéndolo yo mismo; y había generado una parte en Java que descarté por el alcance. Verifiqué cada cifra ejecutando el código y revisé el texto antes de entregarlo.</w:t>
+        <w:t>En esta práctica utilicé un agente de programación (el Gentleman, Pi) basado en el modelo Claude de Anthropic como herramienta de apoyo para leer la guía y proponer la regla de contacto común, escribir el modelo en SimPy con arquitectura MVC y sus 9 pruebas, construir el modelo de NetLogo (botones, gráficos e importación del CSV, personas animadas), generar las figuras, medir las réplicas y los tiempos, y redactar borradores de este informe.</w:t>
+      </w:r>
+    </w:p>
+    <w:p>
+      <w:pPr>
+        <w:keepNext/>
+        <w:spacing w:before="160"/>
+      </w:pPr>
+      <w:r>
+        <w:rPr>
+          <w:b/>
+        </w:rPr>
+        <w:t>Análisis y correcciones</w:t>
+      </w:r>
+    </w:p>
+    <w:p>
+      <w:pPr>
+        <w:keepNext/>
+        <w:jc w:val="both"/>
+      </w:pPr>
+      <w:r>
+        <w:rPr>
+          <w:b w:val="0"/>
+        </w:rPr>
+        <w:t>Las decisiones de alcance (sin Java), de la regla de contacto, de la semilla 42 y del contenido las tomé yo. Al revisar lo que generó la IA encontré y corregí tres errores:</w:t>
+      </w:r>
+    </w:p>
+    <w:p>
+      <w:pPr>
+        <w:pStyle w:val="ListBullet"/>
+        <w:spacing w:after="60"/>
+        <w:jc w:val="both"/>
+      </w:pPr>
+      <w:r>
+        <w:rPr>
+          <w:b w:val="0"/>
+        </w:rPr>
+        <w:t>La semilla de NetLogo estaba en 12345; la cambié a 42 para igualarla con la de Python.</w:t>
+      </w:r>
+    </w:p>
+    <w:p>
+      <w:pPr>
+        <w:pStyle w:val="ListBullet"/>
+        <w:spacing w:after="60"/>
+        <w:jc w:val="both"/>
+      </w:pPr>
+      <w:r>
+        <w:rPr>
+          <w:b w:val="0"/>
+        </w:rPr>
+        <w:t>El modelo de NetLogo se abría como un modelo vacío en la interfaz; se corrigió y lo comprobé abriéndolo yo mismo.</w:t>
+      </w:r>
+    </w:p>
+    <w:p>
+      <w:pPr>
+        <w:pStyle w:val="ListBullet"/>
+        <w:spacing w:after="60"/>
+        <w:jc w:val="both"/>
+      </w:pPr>
+      <w:r>
+        <w:rPr>
+          <w:b w:val="0"/>
+        </w:rPr>
+        <w:t>Había generado una parte en Java, que descarté porque estaba fuera del alcance de la práctica.</w:t>
+      </w:r>
+    </w:p>
+    <w:p>
+      <w:pPr>
+        <w:keepNext w:val="0"/>
+        <w:jc w:val="both"/>
+      </w:pPr>
+      <w:r>
+        <w:rPr>
+          <w:b w:val="0"/>
+        </w:rPr>
+        <w:t>Verifiqué cada cifra ejecutando el código y revisé el texto antes de entregarlo.</w:t>
+      </w:r>
+    </w:p>
+    <w:p>
+      <w:pPr>
+        <w:keepNext/>
+        <w:spacing w:before="160"/>
+      </w:pPr>
+      <w:r>
+        <w:rPr>
+          <w:b/>
+        </w:rPr>
+        <w:t>Prompts utilizados</w:t>
       </w:r>
     </w:p>
     <w:p>

</xml_diff>

<commit_message>
docs(ape-4): use the guide's control questions verbatim and cite official docs
</commit_message>
<xml_diff>
--- a/unidad-1/ape-4-sir-herramientas/documento/APE4.docx
+++ b/unidad-1/ape-4-sir-herramientas/documento/APE4.docx
@@ -4453,7 +4453,7 @@
         <w:rPr>
           <w:b/>
         </w:rPr>
-        <w:t>¿Por qué es importante utilizar los mismos parámetros en las herramientas?</w:t>
+        <w:t>¿Por qué es importante utilizar los mismos parámetros en las tres herramientas?</w:t>
       </w:r>
     </w:p>
     <w:p>
@@ -4477,7 +4477,7 @@
         <w:rPr>
           <w:b/>
         </w:rPr>
-        <w:t>¿Por qué Python y NetLogo pueden producir resultados diferentes con el mismo modelo?</w:t>
+        <w:t>¿Por qué Python, Java y NetLogo pueden producir resultados diferentes utilizando el mismo modelo?</w:t>
       </w:r>
     </w:p>
     <w:p>
@@ -4489,7 +4489,7 @@
         <w:rPr>
           <w:b w:val="0"/>
         </w:rPr>
-        <w:t>Porque el modelo es estocástico y cada herramienta tiene su generador de números aleatorios (PCG64 en NumPy, Mersenne Twister en NetLogo) y su propio orden de consumo. Con la semilla 42 el pico fue 36 en Python y 31 en NetLogo, pero con 30 réplicas los promedios fueron 36.13 y 35.33. Lo mismo aplica a Java, que no se implementó.</w:t>
+        <w:t>Porque el modelo es estocástico y cada herramienta tiene su generador de números aleatorios: NumPy usa PCG64 por defecto (NumPy Developers, s. f.) y NetLogo, Mersenne Twister (Wilensky, s. f.); además, cada una consume los números en su propio orden. Con la semilla 42 el pico fue 36 en Python y 31 en NetLogo, pero con 30 réplicas los promedios fueron 36.13 y 35.33. Lo mismo aplica a Java, que no se implementó.</w:t>
       </w:r>
     </w:p>
     <w:p>
@@ -4513,7 +4513,7 @@
         <w:rPr>
           <w:b w:val="0"/>
         </w:rPr>
-        <w:t>Los agentes son parte del lenguaje: cada tortuga tiene sus variables, ask les da órdenes y se ve el mundo cambiar de color mientras corre. Además, los controles deslizantes y los gráficos permiten explorar parámetros sin programar. Esto lo comprobé al construir el modelo con 339 líneas.</w:t>
+        <w:t>Los agentes son parte del lenguaje: las tortugas son agentes que se mueven en el mundo y el comando ask les da órdenes (Wilensky, s. f.), así que se ve el mundo cambiar de color mientras corre. Además, los deslizadores crean variables globales y los gráficos se arman en la pestaña Interface (Wilensky, s. f.), lo que permite explorar parámetros sin programar. Esto lo comprobé al construir el modelo con 339 líneas.</w:t>
       </w:r>
     </w:p>
     <w:p>
@@ -4537,7 +4537,7 @@
         <w:rPr>
           <w:b w:val="0"/>
         </w:rPr>
-        <w:t>Maneja un reloj de simulación y procesos escritos como funciones generadoras que esperan con env.timeout, además de recursos para colas (como en la práctica 3). El tiempo simulado es independiente del tiempo real. En este modelo solo usé un proceso con paso fijo, así que aproveché poco la lógica de eventos.</w:t>
+        <w:t>SimPy es una biblioteca de simulación de eventos discretos: los procesos se escriben como generadores de Python que esperan con eventos Timeout, y el entorno lleva el tiempo simulado en Environment.now (Team SimPy, s. f.‑a). También ofrece recursos de capacidad limitada que atienden a los procesos en orden FIFO (Team SimPy, s. f.‑b), como en la práctica 3. En este modelo solo usé un proceso con paso fijo, así que aproveché poco la lógica de eventos.</w:t>
       </w:r>
     </w:p>
     <w:p>
@@ -4561,7 +4561,7 @@
         <w:rPr>
           <w:b w:val="0"/>
         </w:rPr>
-        <w:t>Conceptualmente, es un lenguaje compilado y de tipado estático, por lo general más rápido que Python en poblaciones grandes o muchas réplicas, con buen manejo de hilos y un ecosistema maduro. En esta práctica no se implementó (decisión del grupo según el alcance), por lo que no tengo medidas propias.</w:t>
+        <w:t>Java es un lenguaje concurrente y orientado a objetos, con tipado fuerte y estático, que normalmente se compila a bytecode para la máquina virtual de Java y define hilos y bloqueos en la propia especificación (Gosling et al., 2023). El tipado estático detecta errores de tipos al compilar y los hilos permiten correr réplicas en paralelo. En esta práctica no se implementó (decisión del grupo según el alcance), por lo que no tengo medidas propias.</w:t>
       </w:r>
     </w:p>
     <w:p>
@@ -4573,7 +4573,7 @@
         <w:rPr>
           <w:b/>
         </w:rPr>
-        <w:t>¿Qué función cumple el archivo CSV en la integración Python → NetLogo?</w:t>
+        <w:t>¿Qué función cumple el archivo CSV en la integración Python/Java → NetLogo?</w:t>
       </w:r>
     </w:p>
     <w:p>
@@ -5138,6 +5138,24 @@
       </w:pPr>
       <w:r>
         <w:rPr/>
+        <w:t xml:space="preserve">Gosling, J., Joy, B., Steele, G., Bracha, G., Buckley, A., Smith, D. y Bierman, G. (2023). </w:t>
+      </w:r>
+      <w:r>
+        <w:rPr>
+          <w:i/>
+        </w:rPr>
+        <w:t>The Java® language specification: Java SE 21 edition</w:t>
+      </w:r>
+      <w:r>
+        <w:t>. Oracle. https://docs.oracle.com/javase/specs/jls/se21/html/index.html</w:t>
+      </w:r>
+    </w:p>
+    <w:p>
+      <w:pPr>
+        <w:ind w:left="720" w:hanging="720"/>
+      </w:pPr>
+      <w:r>
+        <w:rPr/>
         <w:t xml:space="preserve">Guamán, J. O. (2026). </w:t>
       </w:r>
       <w:r>
@@ -5148,6 +5166,78 @@
       </w:r>
       <w:r>
         <w:t xml:space="preserve"> [Diapositivas de clase, semana 4]. Asignatura Simulación, Carrera de Computación, Universidad Nacional de Loja.</w:t>
+      </w:r>
+    </w:p>
+    <w:p>
+      <w:pPr>
+        <w:ind w:left="720" w:hanging="720"/>
+      </w:pPr>
+      <w:r>
+        <w:rPr/>
+        <w:t xml:space="preserve">NumPy Developers. (s. f.). </w:t>
+      </w:r>
+      <w:r>
+        <w:rPr>
+          <w:i/>
+        </w:rPr>
+        <w:t>Random Generator</w:t>
+      </w:r>
+      <w:r>
+        <w:t>. NumPy documentation. https://numpy.org/doc/stable/reference/random/generator.html</w:t>
+      </w:r>
+    </w:p>
+    <w:p>
+      <w:pPr>
+        <w:ind w:left="720" w:hanging="720"/>
+      </w:pPr>
+      <w:r>
+        <w:rPr/>
+        <w:t xml:space="preserve">Team SimPy. (s. f.‑a). </w:t>
+      </w:r>
+      <w:r>
+        <w:rPr>
+          <w:i/>
+        </w:rPr>
+        <w:t>Basic concepts</w:t>
+      </w:r>
+      <w:r>
+        <w:t>. SimPy documentation. https://simpy.readthedocs.io/en/latest/simpy_intro/basic_concepts.html</w:t>
+      </w:r>
+    </w:p>
+    <w:p>
+      <w:pPr>
+        <w:ind w:left="720" w:hanging="720"/>
+      </w:pPr>
+      <w:r>
+        <w:rPr/>
+        <w:t xml:space="preserve">Team SimPy. (s. f.‑b). </w:t>
+      </w:r>
+      <w:r>
+        <w:rPr>
+          <w:i/>
+        </w:rPr>
+        <w:t>Shared resources</w:t>
+      </w:r>
+      <w:r>
+        <w:t>. SimPy documentation. https://simpy.readthedocs.io/en/latest/simpy_intro/shared_resources.html</w:t>
+      </w:r>
+    </w:p>
+    <w:p>
+      <w:pPr>
+        <w:ind w:left="720" w:hanging="720"/>
+      </w:pPr>
+      <w:r>
+        <w:rPr/>
+        <w:t xml:space="preserve">Wilensky, U. (s. f.). </w:t>
+      </w:r>
+      <w:r>
+        <w:rPr>
+          <w:i/>
+        </w:rPr>
+        <w:t>NetLogo programming guide</w:t>
+      </w:r>
+      <w:r>
+        <w:t>. Center for Connected Learning and Computer-Based Modeling, Northwestern University. https://docs.netlogo.org/programming.html</w:t>
       </w:r>
     </w:p>
     <w:sectPr>

</xml_diff>

<commit_message>
docs(ape-4): switch citations to IEEE numbered style
</commit_message>
<xml_diff>
--- a/unidad-1/ape-4-sir-herramientas/documento/APE4.docx
+++ b/unidad-1/ape-4-sir-herramientas/documento/APE4.docx
@@ -4489,7 +4489,7 @@
         <w:rPr>
           <w:b w:val="0"/>
         </w:rPr>
-        <w:t>Porque el modelo es estocástico y cada herramienta tiene su generador de números aleatorios: NumPy usa PCG64 por defecto (NumPy Developers, s. f.) y NetLogo, Mersenne Twister (Wilensky, s. f.); además, cada una consume los números en su propio orden. Con la semilla 42 el pico fue 36 en Python y 31 en NetLogo, pero con 30 réplicas los promedios fueron 36.13 y 35.33. Lo mismo aplica a Java, que no se implementó.</w:t>
+        <w:t>Porque el modelo es estocástico y cada herramienta tiene su generador de números aleatorios: NumPy usa PCG64 por defecto [1] y NetLogo, Mersenne Twister [2]; además, cada una consume los números en su propio orden. Con la semilla 42 el pico fue 36 en Python y 31 en NetLogo, pero con 30 réplicas los promedios fueron 36.13 y 35.33. Lo mismo aplica a Java, que no se implementó.</w:t>
       </w:r>
     </w:p>
     <w:p>
@@ -4513,7 +4513,7 @@
         <w:rPr>
           <w:b w:val="0"/>
         </w:rPr>
-        <w:t>Los agentes son parte del lenguaje: las tortugas son agentes que se mueven en el mundo y el comando ask les da órdenes (Wilensky, s. f.), así que se ve el mundo cambiar de color mientras corre. Además, los deslizadores crean variables globales y los gráficos se arman en la pestaña Interface (Wilensky, s. f.), lo que permite explorar parámetros sin programar. Esto lo comprobé al construir el modelo con 339 líneas.</w:t>
+        <w:t>Los agentes son parte del lenguaje: las tortugas son agentes que se mueven en el mundo y el comando ask les da órdenes [2], así que se ve el mundo cambiar de color mientras corre. Además, los deslizadores crean variables globales y los gráficos se arman en la pestaña Interface [2], lo que permite explorar parámetros sin programar. Esto lo comprobé al construir el modelo con 339 líneas.</w:t>
       </w:r>
     </w:p>
     <w:p>
@@ -4537,7 +4537,7 @@
         <w:rPr>
           <w:b w:val="0"/>
         </w:rPr>
-        <w:t>SimPy es una biblioteca de simulación de eventos discretos: los procesos se escriben como generadores de Python que esperan con eventos Timeout, y el entorno lleva el tiempo simulado en Environment.now (Team SimPy, s. f.‑a). También ofrece recursos de capacidad limitada que atienden a los procesos en orden FIFO (Team SimPy, s. f.‑b), como en la práctica 3. En este modelo solo usé un proceso con paso fijo, así que aproveché poco la lógica de eventos.</w:t>
+        <w:t>SimPy es una biblioteca de simulación de eventos discretos: los procesos se escriben como generadores de Python que esperan con eventos Timeout, y el entorno lleva el tiempo simulado en Environment.now [3]. También ofrece recursos de capacidad limitada que atienden a los procesos en orden FIFO [4], como en la práctica 3. En este modelo solo usé un proceso con paso fijo, así que aproveché poco la lógica de eventos.</w:t>
       </w:r>
     </w:p>
     <w:p>
@@ -4561,7 +4561,7 @@
         <w:rPr>
           <w:b w:val="0"/>
         </w:rPr>
-        <w:t>Java es un lenguaje concurrente y orientado a objetos, con tipado fuerte y estático, que normalmente se compila a bytecode para la máquina virtual de Java y define hilos y bloqueos en la propia especificación (Gosling et al., 2023). El tipado estático detecta errores de tipos al compilar y los hilos permiten correr réplicas en paralelo. En esta práctica no se implementó (decisión del grupo según el alcance), por lo que no tengo medidas propias.</w:t>
+        <w:t>Java es un lenguaje concurrente y orientado a objetos, con tipado fuerte y estático, que normalmente se compila a bytecode para la máquina virtual de Java y define hilos y bloqueos en la propia especificación [5]. El tipado estático detecta errores de tipos al compilar y los hilos permiten correr réplicas en paralelo. En esta práctica no se implementó (decisión del grupo según el alcance), por lo que no tengo medidas propias.</w:t>
       </w:r>
     </w:p>
     <w:p>
@@ -5134,110 +5134,122 @@
     </w:p>
     <w:p>
       <w:pPr>
-        <w:ind w:left="720" w:hanging="720"/>
+        <w:ind w:left="567" w:hanging="567"/>
       </w:pPr>
       <w:r>
         <w:rPr/>
-        <w:t xml:space="preserve">Gosling, J., Joy, B., Steele, G., Bracha, G., Buckley, A., Smith, D. y Bierman, G. (2023). </w:t>
+        <w:t>[1]</w:t>
+        <w:tab/>
+        <w:t xml:space="preserve">NumPy Developers, </w:t>
+      </w:r>
+      <w:r>
+        <w:rPr>
+          <w:i w:val="0"/>
+        </w:rPr>
+        <w:t>“Random Generator,”</w:t>
+      </w:r>
+      <w:r>
+        <w:t xml:space="preserve"> NumPy Documentation. [En línea]. Disponible: https://numpy.org/doc/stable/reference/random/generator.html. Accedido: 23 de octubre de 2026.</w:t>
+      </w:r>
+    </w:p>
+    <w:p>
+      <w:pPr>
+        <w:ind w:left="567" w:hanging="567"/>
+      </w:pPr>
+      <w:r>
+        <w:rPr/>
+        <w:t>[2]</w:t>
+        <w:tab/>
+        <w:t xml:space="preserve">U. Wilensky, </w:t>
+      </w:r>
+      <w:r>
+        <w:rPr>
+          <w:i w:val="0"/>
+        </w:rPr>
+        <w:t>“NetLogo Programming Guide,”</w:t>
+      </w:r>
+      <w:r>
+        <w:t xml:space="preserve"> Center for Connected Learning and Computer-Based Modeling, Northwestern University. [En línea]. Disponible: https://docs.netlogo.org/programming.html. Accedido: 23 de octubre de 2026.</w:t>
+      </w:r>
+    </w:p>
+    <w:p>
+      <w:pPr>
+        <w:ind w:left="567" w:hanging="567"/>
+      </w:pPr>
+      <w:r>
+        <w:rPr/>
+        <w:t>[3]</w:t>
+        <w:tab/>
+        <w:t xml:space="preserve">Team SimPy, </w:t>
+      </w:r>
+      <w:r>
+        <w:rPr>
+          <w:i w:val="0"/>
+        </w:rPr>
+        <w:t>“Basic Concepts,”</w:t>
+      </w:r>
+      <w:r>
+        <w:t xml:space="preserve"> SimPy Documentation. [En línea]. Disponible: https://simpy.readthedocs.io/en/latest/simpy_intro/basic_concepts.html. Accedido: 23 de octubre de 2026.</w:t>
+      </w:r>
+    </w:p>
+    <w:p>
+      <w:pPr>
+        <w:ind w:left="567" w:hanging="567"/>
+      </w:pPr>
+      <w:r>
+        <w:rPr/>
+        <w:t>[4]</w:t>
+        <w:tab/>
+        <w:t xml:space="preserve">Team SimPy, </w:t>
+      </w:r>
+      <w:r>
+        <w:rPr>
+          <w:i w:val="0"/>
+        </w:rPr>
+        <w:t>“Shared Resources,”</w:t>
+      </w:r>
+      <w:r>
+        <w:t xml:space="preserve"> SimPy Documentation. [En línea]. Disponible: https://simpy.readthedocs.io/en/latest/simpy_intro/shared_resources.html. Accedido: 23 de octubre de 2026.</w:t>
+      </w:r>
+    </w:p>
+    <w:p>
+      <w:pPr>
+        <w:ind w:left="567" w:hanging="567"/>
+      </w:pPr>
+      <w:r>
+        <w:rPr/>
+        <w:t>[5]</w:t>
+        <w:tab/>
+        <w:t xml:space="preserve">J. Gosling, B. Joy, G. Steele, G. Bracha, A. Buckley, D. Smith y G. Bierman, </w:t>
       </w:r>
       <w:r>
         <w:rPr>
           <w:i/>
         </w:rPr>
-        <w:t>The Java® language specification: Java SE 21 edition</w:t>
+        <w:t>The Java Language Specification, Java SE 21 Edition.</w:t>
       </w:r>
       <w:r>
-        <w:t>. Oracle. https://docs.oracle.com/javase/specs/jls/se21/html/index.html</w:t>
+        <w:t xml:space="preserve"> Oracle, 2023. [En línea]. Disponible: https://docs.oracle.com/javase/specs/jls/se21/html/index.html. Accedido: 23 de octubre de 2026.</w:t>
       </w:r>
     </w:p>
     <w:p>
       <w:pPr>
-        <w:ind w:left="720" w:hanging="720"/>
+        <w:ind w:left="567" w:hanging="567"/>
       </w:pPr>
       <w:r>
         <w:rPr/>
-        <w:t xml:space="preserve">Guamán, J. O. (2026). </w:t>
+        <w:t>[6]</w:t>
+        <w:tab/>
+        <w:t xml:space="preserve">J. O. Guamán, </w:t>
       </w:r>
       <w:r>
         <w:rPr>
-          <w:i/>
+          <w:i w:val="0"/>
         </w:rPr>
-        <w:t>Diapositivas de la semana 4</w:t>
+        <w:t>“Diapositivas de la semana 4,”</w:t>
       </w:r>
       <w:r>
-        <w:t xml:space="preserve"> [Diapositivas de clase, semana 4]. Asignatura Simulación, Carrera de Computación, Universidad Nacional de Loja.</w:t>
-      </w:r>
-    </w:p>
-    <w:p>
-      <w:pPr>
-        <w:ind w:left="720" w:hanging="720"/>
-      </w:pPr>
-      <w:r>
-        <w:rPr/>
-        <w:t xml:space="preserve">NumPy Developers. (s. f.). </w:t>
-      </w:r>
-      <w:r>
-        <w:rPr>
-          <w:i/>
-        </w:rPr>
-        <w:t>Random Generator</w:t>
-      </w:r>
-      <w:r>
-        <w:t>. NumPy documentation. https://numpy.org/doc/stable/reference/random/generator.html</w:t>
-      </w:r>
-    </w:p>
-    <w:p>
-      <w:pPr>
-        <w:ind w:left="720" w:hanging="720"/>
-      </w:pPr>
-      <w:r>
-        <w:rPr/>
-        <w:t xml:space="preserve">Team SimPy. (s. f.‑a). </w:t>
-      </w:r>
-      <w:r>
-        <w:rPr>
-          <w:i/>
-        </w:rPr>
-        <w:t>Basic concepts</w:t>
-      </w:r>
-      <w:r>
-        <w:t>. SimPy documentation. https://simpy.readthedocs.io/en/latest/simpy_intro/basic_concepts.html</w:t>
-      </w:r>
-    </w:p>
-    <w:p>
-      <w:pPr>
-        <w:ind w:left="720" w:hanging="720"/>
-      </w:pPr>
-      <w:r>
-        <w:rPr/>
-        <w:t xml:space="preserve">Team SimPy. (s. f.‑b). </w:t>
-      </w:r>
-      <w:r>
-        <w:rPr>
-          <w:i/>
-        </w:rPr>
-        <w:t>Shared resources</w:t>
-      </w:r>
-      <w:r>
-        <w:t>. SimPy documentation. https://simpy.readthedocs.io/en/latest/simpy_intro/shared_resources.html</w:t>
-      </w:r>
-    </w:p>
-    <w:p>
-      <w:pPr>
-        <w:ind w:left="720" w:hanging="720"/>
-      </w:pPr>
-      <w:r>
-        <w:rPr/>
-        <w:t xml:space="preserve">Wilensky, U. (s. f.). </w:t>
-      </w:r>
-      <w:r>
-        <w:rPr>
-          <w:i/>
-        </w:rPr>
-        <w:t>NetLogo programming guide</w:t>
-      </w:r>
-      <w:r>
-        <w:t>. Center for Connected Learning and Computer-Based Modeling, Northwestern University. https://docs.netlogo.org/programming.html</w:t>
+        <w:t xml:space="preserve"> diapositivas de clase, asignatura Simulación, Carrera de Computación, Universidad Nacional de Loja, Loja, Ecuador, 2026.</w:t>
       </w:r>
     </w:p>
     <w:sectPr>

</xml_diff>

<commit_message>
docs(ape-4): focus conclusions on tool and chart comparison
</commit_message>
<xml_diff>
--- a/unidad-1/ape-4-sir-herramientas/documento/APE4.docx
+++ b/unidad-1/ape-4-sir-herramientas/documento/APE4.docx
@@ -4628,6 +4628,7 @@
     <w:p>
       <w:pPr>
         <w:pStyle w:val="ListBullet"/>
+        <w:keepLines/>
         <w:spacing w:after="60"/>
         <w:jc w:val="both"/>
       </w:pPr>
@@ -4635,7 +4636,7 @@
         <w:rPr>
           <w:b w:val="0"/>
         </w:rPr>
-        <w:t>Se implementó el modelo SIR con los mismos parámetros y la misma regla de contacto en Python/SimPy y en NetLogo. Ambas producen epidemias con un pico y cerca de 93 recuperados al final, y concuerdan con las ecuaciones diferenciales.</w:t>
+        <w:t>Aprendí a comparar las gráficas por el conjunto y no por una sola corrida: con la misma semilla las curvas de Python y NetLogo se separan (pico de 36 frente a 31), pero con 30 réplicas los promedios casi coinciden (36.13 y 35.33) y los dos quedan cerca de la curva de las ecuaciones (33.0).</w:t>
       </w:r>
     </w:p>
     <w:p>
@@ -4648,7 +4649,7 @@
         <w:rPr>
           <w:b w:val="0"/>
         </w:rPr>
-        <w:t>La integración por CSV funcionó: Python generó los datos, NetLogo los importó y graficó, y NetLogo exportó los suyos para la comparación. Separar datos y visualización permitió probar el modelo sin gráficos.</w:t>
+        <w:t>Aprendí a usar cada herramienta para lo que mejor hace: Python/SimPy genera y prueba los datos, y NetLogo los importa por CSV para mostrarlos. El CSV permite que una herramienta no dependa del código de la otra.</w:t>
       </w:r>
     </w:p>
     <w:p>
@@ -4661,33 +4662,7 @@
         <w:rPr>
           <w:b w:val="0"/>
         </w:rPr>
-        <w:t>Con la misma semilla las dos herramientas dan resultados distintos (pico 36 frente a 31) porque usan generadores y órdenes de consumo distintos; con 30 réplicas los promedios coinciden (t de Welch menor que 1.1 en las cuatro métricas).</w:t>
-      </w:r>
-    </w:p>
-    <w:p>
-      <w:pPr>
-        <w:pStyle w:val="ListBullet"/>
-        <w:spacing w:after="60"/>
-        <w:jc w:val="both"/>
-      </w:pPr>
-      <w:r>
-        <w:rPr>
-          <w:b w:val="0"/>
-        </w:rPr>
-        <w:t>NetLogo es más rápido de construir y de explorar de forma visual; Python/SimPy exige más código, pero es más flexible para analizar y automatizar. Python fue unas ocho veces más rápido por corrida en este equipo.</w:t>
-      </w:r>
-    </w:p>
-    <w:p>
-      <w:pPr>
-        <w:pStyle w:val="ListBullet"/>
-        <w:spacing w:after="60"/>
-        <w:jc w:val="both"/>
-      </w:pPr>
-      <w:r>
-        <w:rPr>
-          <w:b w:val="0"/>
-        </w:rPr>
-        <w:t>La práctica se limitó a dos herramientas; la comparación con Java de la guía queda fuera del alcance acordado.</w:t>
+        <w:t>Al comparar las herramientas, NetLogo resultó más rápido de construir y de explorar de forma visual, mientras que Python exige más código, pero es más flexible para analizar y fue unas ocho veces más rápido por corrida. La elección depende de si se quiere mostrar el modelo o analizar sus resultados.</w:t>
       </w:r>
     </w:p>
     <w:p>

</xml_diff>

<commit_message>
docs(ape-4): link demo video and sync script with recording
</commit_message>
<xml_diff>
--- a/unidad-1/ape-4-sir-herramientas/documento/APE4.docx
+++ b/unidad-1/ape-4-sir-herramientas/documento/APE4.docx
@@ -4348,6 +4348,24 @@
     </w:p>
     <w:p>
       <w:pPr>
+        <w:keepNext w:val="0"/>
+        <w:jc w:val="left"/>
+      </w:pPr>
+      <w:r>
+        <w:rPr>
+          <w:b/>
+        </w:rPr>
+        <w:t>Video de demostración:</w:t>
+      </w:r>
+      <w:r>
+        <w:rPr>
+          <w:b w:val="0"/>
+        </w:rPr>
+        <w:t xml:space="preserve"> https://drive.google.com/file/d/18VHhPuVMW9BmSG0HTGGzGLD1AiPp2kto/view</w:t>
+      </w:r>
+    </w:p>
+    <w:p>
+      <w:pPr>
         <w:keepNext/>
         <w:spacing w:before="240"/>
       </w:pPr>

</xml_diff>

<commit_message>
docs(ape-4): replace Python-only replica figure with tool comparison
</commit_message>
<xml_diff>
--- a/unidad-1/ape-4-sir-herramientas/documento/APE4.docx
+++ b/unidad-1/ape-4-sir-herramientas/documento/APE4.docx
@@ -2228,7 +2228,7 @@
         <w:rPr>
           <w:b w:val="0"/>
         </w:rPr>
-        <w:t>Las Figuras 1 a 3 corresponden a Python/SimPy; la Figura 4, a NetLogo; la Figura 5 compara las dos herramientas con la misma semilla. Las cifras que se comparan están en la Tabla 4.</w:t>
+        <w:t>Las Figuras 1 y 2 corresponden a Python/SimPy; la Figura 3, a NetLogo; la Figura 4 compara las dos herramientas con la misma semilla y la Figura 5, con 30 réplicas. Las cifras que se comparan están en la Tabla 4.</w:t>
       </w:r>
     </w:p>
     <w:p>
@@ -2403,59 +2403,6 @@
     </w:p>
     <w:p>
       <w:pPr>
-        <w:keepNext/>
-        <w:jc w:val="center"/>
-      </w:pPr>
-      <w:r>
-        <w:drawing>
-          <wp:inline xmlns:a="http://schemas.openxmlformats.org/drawingml/2006/main" xmlns:pic="http://schemas.openxmlformats.org/drawingml/2006/picture">
-            <wp:extent cx="3060000" cy="1967143"/>
-            <wp:docPr id="3" name="Picture 3"/>
-            <wp:cNvGraphicFramePr>
-              <a:graphicFrameLocks noChangeAspect="1"/>
-            </wp:cNvGraphicFramePr>
-            <a:graphic>
-              <a:graphicData uri="http://schemas.openxmlformats.org/drawingml/2006/picture">
-                <pic:pic>
-                  <pic:nvPicPr>
-                    <pic:cNvPr id="0" name="sir_replicas.png"/>
-                    <pic:cNvPicPr/>
-                  </pic:nvPicPr>
-                  <pic:blipFill>
-                    <a:blip r:embed="rId12"/>
-                    <a:stretch>
-                      <a:fillRect/>
-                    </a:stretch>
-                  </pic:blipFill>
-                  <pic:spPr>
-                    <a:xfrm>
-                      <a:off x="0" y="0"/>
-                      <a:ext cx="3060000" cy="1967143"/>
-                    </a:xfrm>
-                    <a:prstGeom prst="rect"/>
-                  </pic:spPr>
-                </pic:pic>
-              </a:graphicData>
-            </a:graphic>
-          </wp:inline>
-        </w:drawing>
-      </w:r>
-    </w:p>
-    <w:p>
-      <w:pPr>
-        <w:keepNext w:val="0"/>
-        <w:jc w:val="center"/>
-      </w:pPr>
-      <w:r>
-        <w:rPr>
-          <w:b w:val="0"/>
-          <w:sz w:val="18"/>
-        </w:rPr>
-        <w:t>Figura 3. Infectados en 30 réplicas de Python (semillas 0 a 29) y banda del 95 %.</w:t>
-      </w:r>
-    </w:p>
-    <w:p>
-      <w:pPr>
         <w:pStyle w:val="ListBullet"/>
         <w:spacing w:after="60"/>
         <w:jc w:val="both"/>
@@ -2464,7 +2411,7 @@
         <w:rPr>
           <w:b w:val="0"/>
         </w:rPr>
-        <w:t>El pico medio es 36.13 con desviación 6.99; en las réplicas va de 24 a 52 infectados.</w:t>
+        <w:t>En 30 réplicas (semillas 0 a 29) el pico medio es 36.13 con desviación 6.99; en las réplicas va de 24 a 52 infectados.</w:t>
       </w:r>
     </w:p>
     <w:p>
@@ -2501,7 +2448,7 @@
         <w:drawing>
           <wp:inline xmlns:a="http://schemas.openxmlformats.org/drawingml/2006/main" xmlns:pic="http://schemas.openxmlformats.org/drawingml/2006/picture">
             <wp:extent cx="4680000" cy="1820000"/>
-            <wp:docPr id="4" name="Picture 4"/>
+            <wp:docPr id="3" name="Picture 3"/>
             <wp:cNvGraphicFramePr>
               <a:graphicFrameLocks noChangeAspect="1"/>
             </wp:cNvGraphicFramePr>
@@ -2513,7 +2460,7 @@
                     <pic:cNvPicPr/>
                   </pic:nvPicPr>
                   <pic:blipFill>
-                    <a:blip r:embed="rId13"/>
+                    <a:blip r:embed="rId12"/>
                     <a:stretch>
                       <a:fillRect/>
                     </a:stretch>
@@ -2542,7 +2489,7 @@
           <w:b w:val="0"/>
           <w:sz w:val="18"/>
         </w:rPr>
-        <w:t>Figura 4. Mundo de NetLogo con semilla 42 en los ticks 0, 17 (pico) y 100: personas en la plaza y líneas rojas de contagio.</w:t>
+        <w:t>Figura 3. Mundo de NetLogo con semilla 42 en los ticks 0, 17 (pico) y 100: personas en la plaza y líneas rojas de contagio.</w:t>
       </w:r>
     </w:p>
     <w:p>
@@ -2568,7 +2515,7 @@
         <w:rPr>
           <w:b w:val="0"/>
         </w:rPr>
-        <w:t>La figura es la vista del mundo exportada con export-view; las líneas rojas del tick 17 son contagios recientes (la clara tiene un tick de antigüedad). Los gráficos de la ventana de NetLogo se reproducen en la Figura 5 con los CSV de ambas herramientas.</w:t>
+        <w:t>La figura es la vista del mundo exportada con export-view; las líneas rojas del tick 17 son contagios recientes (la clara tiene un tick de antigüedad). Los gráficos de la ventana de NetLogo se reproducen en la Figura 4 con los CSV de ambas herramientas.</w:t>
       </w:r>
     </w:p>
     <w:p>
@@ -3283,7 +3230,7 @@
         <w:drawing>
           <wp:inline xmlns:a="http://schemas.openxmlformats.org/drawingml/2006/main" xmlns:pic="http://schemas.openxmlformats.org/drawingml/2006/picture">
             <wp:extent cx="2520000" cy="3240000"/>
-            <wp:docPr id="5" name="Picture 5"/>
+            <wp:docPr id="4" name="Picture 4"/>
             <wp:cNvGraphicFramePr>
               <a:graphicFrameLocks noChangeAspect="1"/>
             </wp:cNvGraphicFramePr>
@@ -3295,7 +3242,7 @@
                     <pic:cNvPicPr/>
                   </pic:nvPicPr>
                   <pic:blipFill>
-                    <a:blip r:embed="rId14"/>
+                    <a:blip r:embed="rId13"/>
                     <a:stretch>
                       <a:fillRect/>
                     </a:stretch>
@@ -3324,7 +3271,60 @@
           <w:b w:val="0"/>
           <w:sz w:val="18"/>
         </w:rPr>
-        <w:t>Figura 5. Comparación de susceptibles, infectados y recuperados entre Python y NetLogo (semilla 42).</w:t>
+        <w:t>Figura 4. Comparación de susceptibles, infectados y recuperados entre Python y NetLogo (semilla 42).</w:t>
+      </w:r>
+    </w:p>
+    <w:p>
+      <w:pPr>
+        <w:keepNext/>
+        <w:jc w:val="center"/>
+      </w:pPr>
+      <w:r>
+        <w:drawing>
+          <wp:inline xmlns:a="http://schemas.openxmlformats.org/drawingml/2006/main" xmlns:pic="http://schemas.openxmlformats.org/drawingml/2006/picture">
+            <wp:extent cx="5400000" cy="2484000"/>
+            <wp:docPr id="5" name="Picture 5"/>
+            <wp:cNvGraphicFramePr>
+              <a:graphicFrameLocks noChangeAspect="1"/>
+            </wp:cNvGraphicFramePr>
+            <a:graphic>
+              <a:graphicData uri="http://schemas.openxmlformats.org/drawingml/2006/picture">
+                <pic:pic>
+                  <pic:nvPicPr>
+                    <pic:cNvPr id="0" name="comparacion_replicas.png"/>
+                    <pic:cNvPicPr/>
+                  </pic:nvPicPr>
+                  <pic:blipFill>
+                    <a:blip r:embed="rId14"/>
+                    <a:stretch>
+                      <a:fillRect/>
+                    </a:stretch>
+                  </pic:blipFill>
+                  <pic:spPr>
+                    <a:xfrm>
+                      <a:off x="0" y="0"/>
+                      <a:ext cx="5400000" cy="2484000"/>
+                    </a:xfrm>
+                    <a:prstGeom prst="rect"/>
+                  </pic:spPr>
+                </pic:pic>
+              </a:graphicData>
+            </a:graphic>
+          </wp:inline>
+        </w:drawing>
+      </w:r>
+    </w:p>
+    <w:p>
+      <w:pPr>
+        <w:keepNext w:val="0"/>
+        <w:jc w:val="center"/>
+      </w:pPr>
+      <w:r>
+        <w:rPr>
+          <w:b w:val="0"/>
+          <w:sz w:val="18"/>
+        </w:rPr>
+        <w:t>Figura 5. Pico de infectados e instante del pico en 30 réplicas de Python y de NetLogo (semillas 0 a 29); cada punto es una corrida, la raya es la media y la línea punteada, la referencia de las ecuaciones.</w:t>
       </w:r>
     </w:p>
     <w:p>
@@ -3336,7 +3336,7 @@
         <w:rPr>
           <w:b w:val="0"/>
         </w:rPr>
-        <w:t>De la Tabla 4 y la Figura 5 se desprenden tres observaciones:</w:t>
+        <w:t>De la Tabla 4 y las Figuras 4 y 5 se desprenden tres observaciones:</w:t>
       </w:r>
     </w:p>
     <w:p>

</xml_diff>

<commit_message>
docs(ape4): drop Java control question and highlight repo and video links
</commit_message>
<xml_diff>
--- a/unidad-1/ape-4-sir-herramientas/documento/APE4.docx
+++ b/unidad-1/ape-4-sir-herramientas/documento/APE4.docx
@@ -4330,39 +4330,158 @@
     </w:p>
     <w:p>
       <w:pPr>
-        <w:keepNext w:val="0"/>
-        <w:jc w:val="left"/>
+        <w:keepNext/>
+        <w:spacing w:before="160"/>
       </w:pPr>
       <w:r>
         <w:rPr>
           <w:b/>
         </w:rPr>
-        <w:t>Repositorio del grupo:</w:t>
-      </w:r>
-      <w:r>
-        <w:rPr>
-          <w:b w:val="0"/>
-        </w:rPr>
-        <w:t xml:space="preserve"> https://github.com/AlejandroTatum/simulacion-ape-4-sir</w:t>
+        <w:t>Repositorio y video de la práctica</w:t>
       </w:r>
     </w:p>
+    <w:tbl>
+      <w:tblPr>
+        <w:tblW w:type="auto" w:w="0"/>
+        <w:jc w:val="center"/>
+        <w:tblBorders>
+          <w:top w:val="single" w:sz="6" w:color="000000"/>
+          <w:left w:val="single" w:sz="6" w:color="000000"/>
+          <w:bottom w:val="single" w:sz="6" w:color="000000"/>
+          <w:right w:val="single" w:sz="6" w:color="000000"/>
+          <w:insideH w:val="single" w:sz="6" w:color="000000"/>
+          <w:insideV w:val="single" w:sz="6" w:color="000000"/>
+        </w:tblBorders>
+        <w:tblLayout w:type="fixed"/>
+        <w:tblLook w:firstColumn="1" w:firstRow="1" w:lastColumn="0" w:lastRow="0" w:noHBand="0" w:noVBand="1" w:val="04A0"/>
+      </w:tblPr>
+      <w:tblGrid>
+        <w:gridCol w:w="2551"/>
+        <w:gridCol w:w="6520"/>
+      </w:tblGrid>
+      <w:tr>
+        <w:trPr>
+          <w:tblHeader w:val="true"/>
+        </w:trPr>
+        <w:tc>
+          <w:tcPr>
+            <w:tcW w:type="dxa" w:w="2551"/>
+          </w:tcPr>
+          <w:p>
+            <w:pPr>
+              <w:keepNext/>
+              <w:spacing w:before="40" w:after="40" w:line="240" w:lineRule="auto"/>
+            </w:pPr>
+            <w:r>
+              <w:rPr>
+                <w:b/>
+                <w:sz w:val="24"/>
+              </w:rPr>
+              <w:t>Recurso</w:t>
+            </w:r>
+          </w:p>
+        </w:tc>
+        <w:tc>
+          <w:tcPr>
+            <w:tcW w:type="dxa" w:w="6520"/>
+          </w:tcPr>
+          <w:p>
+            <w:pPr>
+              <w:keepNext/>
+              <w:spacing w:before="40" w:after="40" w:line="240" w:lineRule="auto"/>
+            </w:pPr>
+            <w:r>
+              <w:rPr>
+                <w:b/>
+                <w:sz w:val="24"/>
+              </w:rPr>
+              <w:t>Enlace</w:t>
+            </w:r>
+          </w:p>
+        </w:tc>
+      </w:tr>
+      <w:tr>
+        <w:tc>
+          <w:tcPr>
+            <w:tcW w:type="dxa" w:w="2551"/>
+          </w:tcPr>
+          <w:p>
+            <w:pPr>
+              <w:keepNext/>
+              <w:spacing w:before="40" w:after="40" w:line="240" w:lineRule="auto"/>
+            </w:pPr>
+            <w:r>
+              <w:rPr>
+                <w:b/>
+                <w:sz w:val="24"/>
+              </w:rPr>
+              <w:t>Repositorio del grupo</w:t>
+            </w:r>
+          </w:p>
+        </w:tc>
+        <w:tc>
+          <w:tcPr>
+            <w:tcW w:type="dxa" w:w="6520"/>
+          </w:tcPr>
+          <w:p>
+            <w:pPr>
+              <w:keepNext/>
+              <w:spacing w:before="40" w:after="40" w:line="240" w:lineRule="auto"/>
+            </w:pPr>
+            <w:r>
+              <w:rPr>
+                <w:b w:val="0"/>
+                <w:sz w:val="24"/>
+              </w:rPr>
+              <w:t>https://github.com/AlejandroTatum/simulacion-ape-4-sir</w:t>
+            </w:r>
+          </w:p>
+        </w:tc>
+      </w:tr>
+      <w:tr>
+        <w:tc>
+          <w:tcPr>
+            <w:tcW w:type="dxa" w:w="2551"/>
+          </w:tcPr>
+          <w:p>
+            <w:pPr>
+              <w:keepNext w:val="0"/>
+              <w:spacing w:before="40" w:after="40" w:line="240" w:lineRule="auto"/>
+            </w:pPr>
+            <w:r>
+              <w:rPr>
+                <w:b/>
+                <w:sz w:val="24"/>
+              </w:rPr>
+              <w:t>Video de demostración</w:t>
+            </w:r>
+          </w:p>
+        </w:tc>
+        <w:tc>
+          <w:tcPr>
+            <w:tcW w:type="dxa" w:w="6520"/>
+          </w:tcPr>
+          <w:p>
+            <w:pPr>
+              <w:keepNext w:val="0"/>
+              <w:spacing w:before="40" w:after="40" w:line="240" w:lineRule="auto"/>
+            </w:pPr>
+            <w:r>
+              <w:rPr>
+                <w:b w:val="0"/>
+                <w:sz w:val="24"/>
+              </w:rPr>
+              <w:t>https://drive.google.com/file/d/18VHhPuVMW9BmSG0HTGGzGLD1AiPp2kto/view</w:t>
+            </w:r>
+          </w:p>
+        </w:tc>
+      </w:tr>
+    </w:tbl>
     <w:p>
       <w:pPr>
-        <w:keepNext w:val="0"/>
-        <w:jc w:val="left"/>
+        <w:spacing w:after="0"/>
+        <w:ind w:left="0"/>
       </w:pPr>
-      <w:r>
-        <w:rPr>
-          <w:b/>
-        </w:rPr>
-        <w:t>Video de demostración:</w:t>
-      </w:r>
-      <w:r>
-        <w:rPr>
-          <w:b w:val="0"/>
-        </w:rPr>
-        <w:t xml:space="preserve"> https://drive.google.com/file/d/18VHhPuVMW9BmSG0HTGGzGLD1AiPp2kto/view</w:t>
-      </w:r>
     </w:p>
     <w:p>
       <w:pPr>
@@ -4471,7 +4590,7 @@
         <w:rPr>
           <w:b/>
         </w:rPr>
-        <w:t>¿Por qué es importante utilizar los mismos parámetros en las tres herramientas?</w:t>
+        <w:t>¿Por qué es importante utilizar los mismos parámetros en las herramientas?</w:t>
       </w:r>
     </w:p>
     <w:p>
@@ -4495,7 +4614,7 @@
         <w:rPr>
           <w:b/>
         </w:rPr>
-        <w:t>¿Por qué Python, Java y NetLogo pueden producir resultados diferentes utilizando el mismo modelo?</w:t>
+        <w:t>¿Por qué Python y NetLogo pueden producir resultados diferentes utilizando el mismo modelo?</w:t>
       </w:r>
     </w:p>
     <w:p>
@@ -4507,7 +4626,7 @@
         <w:rPr>
           <w:b w:val="0"/>
         </w:rPr>
-        <w:t>Porque el modelo es estocástico y cada herramienta tiene su generador de números aleatorios: NumPy usa PCG64 por defecto [1] y NetLogo, Mersenne Twister [2]; además, cada una consume los números en su propio orden. Con la semilla 42 el pico fue 36 en Python y 31 en NetLogo, pero con 30 réplicas los promedios fueron 36.13 y 35.33. Lo mismo aplica a Java, que no se implementó.</w:t>
+        <w:t>Porque el modelo es estocástico y cada herramienta tiene su generador de números aleatorios: NumPy usa PCG64 por defecto [1] y NetLogo, Mersenne Twister [2]; además, cada una consume los números en su propio orden. Con la semilla 42 el pico fue 36 en Python y 31 en NetLogo, pero con 30 réplicas los promedios fueron 36.13 y 35.33.</w:t>
       </w:r>
     </w:p>
     <w:p>
@@ -4567,31 +4686,7 @@
         <w:rPr>
           <w:b/>
         </w:rPr>
-        <w:t>¿Qué ventajas ofrece Java para implementar modelos de simulación?</w:t>
-      </w:r>
-    </w:p>
-    <w:p>
-      <w:pPr>
-        <w:keepNext w:val="0"/>
-        <w:jc w:val="both"/>
-      </w:pPr>
-      <w:r>
-        <w:rPr>
-          <w:b w:val="0"/>
-        </w:rPr>
-        <w:t>Java es un lenguaje concurrente y orientado a objetos, con tipado fuerte y estático, que normalmente se compila a bytecode para la máquina virtual de Java y define hilos y bloqueos en la propia especificación [5]. El tipado estático detecta errores de tipos al compilar y los hilos permiten correr réplicas en paralelo. En esta práctica no se implementó (decisión del grupo según el alcance), por lo que no tengo medidas propias.</w:t>
-      </w:r>
-    </w:p>
-    <w:p>
-      <w:pPr>
-        <w:pStyle w:val="ListBullet"/>
-        <w:keepNext/>
-      </w:pPr>
-      <w:r>
-        <w:rPr>
-          <w:b/>
-        </w:rPr>
-        <w:t>¿Qué función cumple el archivo CSV en la integración Python/Java → NetLogo?</w:t>
+        <w:t>¿Qué función cumple el archivo CSV en la integración Python → NetLogo?</w:t>
       </w:r>
     </w:p>
     <w:p>
@@ -5213,26 +5308,6 @@
         <w:rPr/>
         <w:t>[5]</w:t>
         <w:tab/>
-        <w:t xml:space="preserve">J. Gosling, B. Joy, G. Steele, G. Bracha, A. Buckley, D. Smith y G. Bierman, </w:t>
-      </w:r>
-      <w:r>
-        <w:rPr>
-          <w:i/>
-        </w:rPr>
-        <w:t>The Java Language Specification, Java SE 21 Edition.</w:t>
-      </w:r>
-      <w:r>
-        <w:t xml:space="preserve"> Oracle, 2023. [En línea]. Disponible: https://docs.oracle.com/javase/specs/jls/se21/html/index.html. Accedido: 23 de octubre de 2026.</w:t>
-      </w:r>
-    </w:p>
-    <w:p>
-      <w:pPr>
-        <w:ind w:left="567" w:hanging="567"/>
-      </w:pPr>
-      <w:r>
-        <w:rPr/>
-        <w:t>[6]</w:t>
-        <w:tab/>
         <w:t xml:space="preserve">J. O. Guamán, </w:t>
       </w:r>
       <w:r>

</xml_diff>